<commit_message>
Update paper6 author block and add paper5 conference deck
- paper6: render author superscripts/affiliations correctly in DOCX build; regenerate PDF/DOCX
- paper5: add ICOIICS presentation deck and speaker notes
- gitignore Office lock files (~$*)

Co-Authored-By: Claude Opus 5.5 <noreply@anthropic.com>
</commit_message>
<xml_diff>
--- a/paper6-timing-fingerprint/paper.docx
+++ b/paper6-timing-fingerprint/paper.docx
@@ -27,7 +27,77 @@
           <w:i w:val="0"/>
           <w:sz w:val="21"/>
         </w:rPr>
-        <w:t>Sisir Reddy Nellore1, Suhas Reddy Annem2, Radhika G3</w:t>
+        <w:t>Dharshini Sanapureddy¹, Naga Jyohi Darisa², Sadhwika Tulasi³, Rohith Reddy T⁴, Radhika G⁵</w:t>
+      </w:r>
+    </w:p>
+    <w:p>
+      <w:pPr>
+        <w:spacing w:after="40"/>
+        <w:jc w:val="center"/>
+      </w:pPr>
+      <w:r>
+        <w:rPr>
+          <w:b w:val="0"/>
+          <w:i/>
+          <w:sz w:val="20"/>
+        </w:rPr>
+        <w:t>Department of Computer Science and Engineering</w:t>
+      </w:r>
+    </w:p>
+    <w:p>
+      <w:pPr>
+        <w:spacing w:after="40"/>
+        <w:jc w:val="center"/>
+      </w:pPr>
+      <w:r>
+        <w:rPr>
+          <w:b w:val="0"/>
+          <w:i/>
+          <w:sz w:val="20"/>
+        </w:rPr>
+        <w:t>Amrita School of Computing, Coimbatore</w:t>
+      </w:r>
+    </w:p>
+    <w:p>
+      <w:pPr>
+        <w:spacing w:after="40"/>
+        <w:jc w:val="center"/>
+      </w:pPr>
+      <w:r>
+        <w:rPr>
+          <w:b w:val="0"/>
+          <w:i/>
+          <w:sz w:val="20"/>
+        </w:rPr>
+        <w:t>Amrita Vishwa Vidyapeetham, India</w:t>
+      </w:r>
+    </w:p>
+    <w:p>
+      <w:pPr>
+        <w:spacing w:after="40"/>
+        <w:jc w:val="center"/>
+      </w:pPr>
+      <w:r>
+        <w:rPr>
+          <w:b w:val="0"/>
+          <w:i w:val="0"/>
+          <w:sz w:val="21"/>
+        </w:rPr>
+        <w:t>cb.sc.u4cse24746@cb.students.amrita.edu¹, cb.sc.u4cse24214@cb.students.amrita.edu²,</w:t>
+      </w:r>
+    </w:p>
+    <w:p>
+      <w:pPr>
+        <w:spacing w:after="40"/>
+        <w:jc w:val="center"/>
+      </w:pPr>
+      <w:r>
+        <w:rPr>
+          <w:b w:val="0"/>
+          <w:i w:val="0"/>
+          <w:sz w:val="21"/>
+        </w:rPr>
+        <w:t>cb.sc.u4cse24054@cb.students.amrita.edu³, cb.sc.u4cse24551@cb.students.amrita.edu⁴, g_radhika@cb.amrita.edu⁵</w:t>
       </w:r>
     </w:p>
     <w:p>

</xml_diff>